<commit_message>
docs(creadores): criterio de aprobacion razonable (no exigencia estetica subjetiva)
Anade explicitamente que FURGOCASA valora el material por cantidad, tecnica y tematica (camper/viaje), pero NO por gusto subjetivo (encuadre, paleta, hora del dia, contenido del plato, etc.).

Landing /es/creadores-de-contenido: recuadro 'Como valoramos el material (sin sorpresas)' en el bloque de cobro+reembolso y nueva FAQ '?Quien decide si las fotos son suficientemente buenas?'.

Contrato modelo: nueva clausula 4.2 bis 'Criterio de aprobacion razonable' y aclaracion en 9.1 punto 2 sobre que las preferencias esteticas no constituyen incumplimiento.

Guia interna: nueva seccion 4.3, nueva FAQ interna y nuevo error tipico a evitar (mezclar gusto personal con criterio de aprobacion). Email modelo: linea de tranquilidad explicita citando la 4.2 bis.

Tres .docx regenerados con pypandoc.

Co-authored-by: Cursor <cursoragent@cursor.com>
</commit_message>
<xml_diff>
--- a/contrato_colaboradores/EMAIL-MODELO-ENVIO-CONTRATO.docx
+++ b/contrato_colaboradores/EMAIL-MODELO-ENVIO-CONTRATO.docx
@@ -1123,6 +1123,62 @@
       </w:pPr>
       <w:r>
         <w:t xml:space="preserve">Si no entregas, lo entregas fuera de plazo o no llega a los mínimos del nivel pactado, el alquiler permanece facturado y no procede reembolso. La fianza, en cualquier caso, sigue su flujo habitual.</w:t>
+      </w:r>
+    </w:p>
+    <w:p>
+      <w:pPr>
+        <w:pStyle w:val="BlockText"/>
+      </w:pPr>
+      <w:r>
+        <w:rPr>
+          <w:b/>
+          <w:bCs/>
+        </w:rPr>
+        <w:t xml:space="preserve">Y para que te quedes tranquilo</w:t>
+      </w:r>
+      <w:r>
+        <w:t xml:space="preserve">: la aprobación es</w:t>
+      </w:r>
+      <w:r>
+        <w:t xml:space="preserve"> </w:t>
+      </w:r>
+      <w:r>
+        <w:rPr>
+          <w:b/>
+          <w:bCs/>
+        </w:rPr>
+        <w:t xml:space="preserve">técnica y temática</w:t>
+      </w:r>
+      <w:r>
+        <w:t xml:space="preserve">, no estética. No vamos a entrar a discutir si el encuadre debería haber sido otro o si el atardecer «no nos convence». Si cumples los mínimos del nivel</w:t>
+      </w:r>
+      <w:r>
+        <w:t xml:space="preserve"> </w:t>
+      </w:r>
+      <w:r>
+        <w:rPr>
+          <w:rStyle w:val="VerbatimChar"/>
+        </w:rPr>
+        <w:t xml:space="preserve">{{NIVEL}}</w:t>
+      </w:r>
+      <w:r>
+        <w:t xml:space="preserve">, está bien hecho y va del tema (camper / viaje), se aprueba. Esto está recogido por escrito en la</w:t>
+      </w:r>
+      <w:r>
+        <w:t xml:space="preserve"> </w:t>
+      </w:r>
+      <w:r>
+        <w:rPr>
+          <w:b/>
+          <w:bCs/>
+        </w:rPr>
+        <w:t xml:space="preserve">Cláusula 4.2 bis</w:t>
+      </w:r>
+      <w:r>
+        <w:t xml:space="preserve"> </w:t>
+      </w:r>
+      <w:r>
+        <w:t xml:space="preserve">del contrato adjunto.</w:t>
       </w:r>
     </w:p>
     <w:p>

</xml_diff>